<commit_message>
add Data Science Professional certification
</commit_message>
<xml_diff>
--- a/assets/KeinChan_Resume_202507.docx
+++ b/assets/KeinChan_Resume_202507.docx
@@ -2724,6 +2724,24 @@
           <w:sz w:val="20"/>
         </w:rPr>
         <w:t>MySQL 8.0 Database Developer Oracle Certified Professional</w:t>
+      </w:r>
+    </w:p>
+    <w:p>
+      <w:pPr>
+        <w:spacing w:line="276" w:lineRule="auto"/>
+        <w:rPr>
+          <w:rFonts w:eastAsia="Arial" w:cs="Arial"/>
+          <w:color w:val="595959" w:themeColor="text2"/>
+          <w:sz w:val="20"/>
+        </w:rPr>
+      </w:pPr>
+      <w:r>
+        <w:rPr>
+          <w:rFonts w:eastAsia="Arial" w:cs="Arial"/>
+          <w:color w:val="595959" w:themeColor="text2"/>
+          <w:sz w:val="20"/>
+        </w:rPr>
+        <w:t>Oracle Cloud Infrastructure 2025 Data Science Professional</w:t>
       </w:r>
     </w:p>
     <w:p>

</xml_diff>